<commit_message>
feat: Backend tesztelések, PDFek, Táblázatok
</commit_message>
<xml_diff>
--- a/docs/Frontend tesztelés/Robot_Tesztek_Magyarazat.docx
+++ b/docs/Frontend tesztelés/Robot_Tesztek_Magyarazat.docx
@@ -4,10 +4,15 @@
   <w:body>
     <w:p>
       <w:pPr>
-        <w:pStyle w:val="Cmsor1"/>
+        <w:pStyle w:val="Cm"/>
       </w:pPr>
       <w:r>
-        <w:t>Robot Framework Tesztesetek Magyarázata</w:t>
+        <w:t>Tesztesetek Magyarázata</w:t>
+      </w:r>
+    </w:p>
+    <w:p>
+      <w:r>
+        <w:t>A tesztek Robot Framework-el lettek automatizálva.</w:t>
       </w:r>
     </w:p>
     <w:p>
@@ -40,10 +45,7 @@
       </w:r>
       <w:r>
         <w:br/>
-        <w:t xml:space="preserve">- </w:t>
-      </w:r>
-      <w:r>
-        <w:t>Átvált a regisztrációs oldalra.</w:t>
+        <w:t>- Átvált a regisztrációs oldalra.</w:t>
       </w:r>
       <w:r>
         <w:br/>
@@ -51,7 +53,15 @@
       </w:r>
       <w:r>
         <w:br/>
-        <w:t>- Elküdli az űrlapot.</w:t>
+        <w:t xml:space="preserve">- </w:t>
+      </w:r>
+      <w:proofErr w:type="spellStart"/>
+      <w:r>
+        <w:t>Elküdli</w:t>
+      </w:r>
+      <w:proofErr w:type="spellEnd"/>
+      <w:r>
+        <w:t xml:space="preserve"> az űrlapot.</w:t>
       </w:r>
       <w:r>
         <w:br/>
@@ -66,10 +76,7 @@
       </w:r>
       <w:r>
         <w:br/>
-        <w:t xml:space="preserve">- A teszt ellenőrzi, hogy megjelenik-e a „Jelentkezz </w:t>
-      </w:r>
-      <w:r>
-        <w:t>be a fiókodba” szöveg.</w:t>
+        <w:t>- A teszt ellenőrzi, hogy megjelenik-e a „Jelentkezz be a fiókodba” szöveg.</w:t>
       </w:r>
       <w:r>
         <w:br/>
@@ -80,12 +87,249 @@
       </w:r>
       <w:r>
         <w:br/>
-        <w:t>Annak validálása, hogy az új felhasználó sikeresen tud regisztrálni.</w:t>
+        <w:t xml:space="preserve">Annak </w:t>
       </w:r>
+      <w:proofErr w:type="spellStart"/>
       <w:r>
-        <w:br/>
+        <w:t>validálása</w:t>
+      </w:r>
+      <w:proofErr w:type="spellEnd"/>
+      <w:r>
+        <w:t>, hogy az új felhasználó sikeresen tud regisztrálni.</w:t>
       </w:r>
     </w:p>
+    <w:tbl>
+      <w:tblPr>
+        <w:tblStyle w:val="Rcsostblzat"/>
+        <w:tblW w:w="8923" w:type="dxa"/>
+        <w:tblLook w:val="04A0" w:firstRow="1" w:lastRow="0" w:firstColumn="1" w:lastColumn="0" w:noHBand="0" w:noVBand="1"/>
+      </w:tblPr>
+      <w:tblGrid>
+        <w:gridCol w:w="3041"/>
+        <w:gridCol w:w="2941"/>
+        <w:gridCol w:w="2941"/>
+      </w:tblGrid>
+      <w:tr>
+        <w:trPr>
+          <w:trHeight w:val="359"/>
+        </w:trPr>
+        <w:tc>
+          <w:tcPr>
+            <w:tcW w:w="3041" w:type="dxa"/>
+            <w:shd w:val="clear" w:color="auto" w:fill="C6D9F1" w:themeFill="text2" w:themeFillTint="33"/>
+          </w:tcPr>
+          <w:p>
+            <w:pPr>
+              <w:rPr>
+                <w:sz w:val="28"/>
+                <w:szCs w:val="28"/>
+              </w:rPr>
+            </w:pPr>
+            <w:r>
+              <w:rPr>
+                <w:sz w:val="28"/>
+                <w:szCs w:val="28"/>
+              </w:rPr>
+              <w:t>Teszt adat:</w:t>
+            </w:r>
+          </w:p>
+        </w:tc>
+        <w:tc>
+          <w:tcPr>
+            <w:tcW w:w="2941" w:type="dxa"/>
+            <w:shd w:val="clear" w:color="auto" w:fill="C6D9F1" w:themeFill="text2" w:themeFillTint="33"/>
+          </w:tcPr>
+          <w:p>
+            <w:pPr>
+              <w:tabs>
+                <w:tab w:val="right" w:pos="1979"/>
+              </w:tabs>
+              <w:rPr>
+                <w:sz w:val="28"/>
+                <w:szCs w:val="28"/>
+              </w:rPr>
+            </w:pPr>
+            <w:r>
+              <w:rPr>
+                <w:sz w:val="28"/>
+                <w:szCs w:val="28"/>
+              </w:rPr>
+              <w:t>Várt eredmény</w:t>
+            </w:r>
+          </w:p>
+        </w:tc>
+        <w:tc>
+          <w:tcPr>
+            <w:tcW w:w="2941" w:type="dxa"/>
+            <w:shd w:val="clear" w:color="auto" w:fill="C6D9F1" w:themeFill="text2" w:themeFillTint="33"/>
+          </w:tcPr>
+          <w:p>
+            <w:pPr>
+              <w:rPr>
+                <w:sz w:val="28"/>
+                <w:szCs w:val="28"/>
+              </w:rPr>
+            </w:pPr>
+            <w:r>
+              <w:rPr>
+                <w:sz w:val="28"/>
+                <w:szCs w:val="28"/>
+              </w:rPr>
+              <w:t>Kapott eredmény</w:t>
+            </w:r>
+          </w:p>
+        </w:tc>
+      </w:tr>
+      <w:tr>
+        <w:trPr>
+          <w:trHeight w:val="359"/>
+        </w:trPr>
+        <w:tc>
+          <w:tcPr>
+            <w:tcW w:w="3041" w:type="dxa"/>
+          </w:tcPr>
+          <w:p>
+            <w:r>
+              <w:t>Név: Teszt Elek</w:t>
+            </w:r>
+          </w:p>
+        </w:tc>
+        <w:tc>
+          <w:tcPr>
+            <w:tcW w:w="2941" w:type="dxa"/>
+          </w:tcPr>
+          <w:p>
+            <w:r>
+              <w:t>Név elfogadva</w:t>
+            </w:r>
+          </w:p>
+        </w:tc>
+        <w:tc>
+          <w:tcPr>
+            <w:tcW w:w="2941" w:type="dxa"/>
+          </w:tcPr>
+          <w:p>
+            <w:r>
+              <w:t>Név elfogadva</w:t>
+            </w:r>
+          </w:p>
+        </w:tc>
+      </w:tr>
+      <w:tr>
+        <w:trPr>
+          <w:trHeight w:val="359"/>
+        </w:trPr>
+        <w:tc>
+          <w:tcPr>
+            <w:tcW w:w="3041" w:type="dxa"/>
+          </w:tcPr>
+          <w:p>
+            <w:r>
+              <w:t xml:space="preserve">Email: </w:t>
+            </w:r>
+            <w:hyperlink r:id="rId6" w:history="1">
+              <w:r>
+                <w:rPr>
+                  <w:rStyle w:val="Hiperhivatkozs"/>
+                </w:rPr>
+                <w:t>Tesztelek@gmail.com</w:t>
+              </w:r>
+            </w:hyperlink>
+          </w:p>
+        </w:tc>
+        <w:tc>
+          <w:tcPr>
+            <w:tcW w:w="2941" w:type="dxa"/>
+          </w:tcPr>
+          <w:p>
+            <w:r>
+              <w:t>Email elfogadva</w:t>
+            </w:r>
+          </w:p>
+        </w:tc>
+        <w:tc>
+          <w:tcPr>
+            <w:tcW w:w="2941" w:type="dxa"/>
+          </w:tcPr>
+          <w:p>
+            <w:r>
+              <w:t>Email elfogadva</w:t>
+            </w:r>
+          </w:p>
+        </w:tc>
+      </w:tr>
+      <w:tr>
+        <w:trPr>
+          <w:trHeight w:val="359"/>
+        </w:trPr>
+        <w:tc>
+          <w:tcPr>
+            <w:tcW w:w="3041" w:type="dxa"/>
+          </w:tcPr>
+          <w:p>
+            <w:r>
+              <w:t>Jelszó:12345678</w:t>
+            </w:r>
+          </w:p>
+        </w:tc>
+        <w:tc>
+          <w:tcPr>
+            <w:tcW w:w="2941" w:type="dxa"/>
+          </w:tcPr>
+          <w:p>
+            <w:r>
+              <w:t>Jelszó elfogadva</w:t>
+            </w:r>
+          </w:p>
+        </w:tc>
+        <w:tc>
+          <w:tcPr>
+            <w:tcW w:w="2941" w:type="dxa"/>
+          </w:tcPr>
+          <w:p>
+            <w:r>
+              <w:t>Jelszó elfogadva</w:t>
+            </w:r>
+          </w:p>
+        </w:tc>
+      </w:tr>
+      <w:tr>
+        <w:trPr>
+          <w:trHeight w:val="359"/>
+        </w:trPr>
+        <w:tc>
+          <w:tcPr>
+            <w:tcW w:w="3041" w:type="dxa"/>
+          </w:tcPr>
+          <w:p>
+            <w:r>
+              <w:t>Jelszó meg:12345678</w:t>
+            </w:r>
+          </w:p>
+        </w:tc>
+        <w:tc>
+          <w:tcPr>
+            <w:tcW w:w="2941" w:type="dxa"/>
+          </w:tcPr>
+          <w:p>
+            <w:r>
+              <w:t>A felhasználó regisztrált</w:t>
+            </w:r>
+          </w:p>
+        </w:tc>
+        <w:tc>
+          <w:tcPr>
+            <w:tcW w:w="2941" w:type="dxa"/>
+          </w:tcPr>
+          <w:p>
+            <w:r>
+              <w:t>A felhasználó regisztrált</w:t>
+            </w:r>
+          </w:p>
+        </w:tc>
+      </w:tr>
+    </w:tbl>
+    <w:p/>
     <w:p>
       <w:pPr>
         <w:pStyle w:val="Cmsor2"/>
@@ -108,10 +352,7 @@
       </w:r>
       <w:r>
         <w:br/>
-        <w:t>- Megnyitja a</w:t>
-      </w:r>
-      <w:r>
-        <w:t xml:space="preserve"> weboldalt.</w:t>
+        <w:t>- Megnyitja a weboldalt.</w:t>
       </w:r>
       <w:r>
         <w:br/>
@@ -134,26 +375,266 @@
       </w:r>
       <w:r>
         <w:br/>
-        <w:t>- Az oldal tartalmazza továbbra is a regisztrációs formot.</w:t>
+        <w:t xml:space="preserve">- Az oldal tartalmazza továbbra is a regisztrációs </w:t>
+      </w:r>
+      <w:proofErr w:type="spellStart"/>
+      <w:r>
+        <w:t>formot</w:t>
+      </w:r>
+      <w:proofErr w:type="spellEnd"/>
+      <w:r>
+        <w:t>.</w:t>
       </w:r>
       <w:r>
         <w:br/>
       </w:r>
       <w:r>
+        <w:lastRenderedPageBreak/>
         <w:br/>
         <w:t>Cél:</w:t>
       </w:r>
       <w:r>
         <w:br/>
-        <w:t>Annak ellenőrzése, ho</w:t>
-      </w:r>
-      <w:r>
-        <w:t>gy a rendszer megfelelően kezeli a duplikált regisztrációt.</w:t>
-      </w:r>
-      <w:r>
-        <w:br/>
+        <w:t>Annak ellenőrzése, hogy a rendszer megfelelően kezeli a duplikált regisztrációt.</w:t>
       </w:r>
     </w:p>
+    <w:tbl>
+      <w:tblPr>
+        <w:tblStyle w:val="Rcsostblzat"/>
+        <w:tblW w:w="8923" w:type="dxa"/>
+        <w:tblLook w:val="04A0" w:firstRow="1" w:lastRow="0" w:firstColumn="1" w:lastColumn="0" w:noHBand="0" w:noVBand="1"/>
+      </w:tblPr>
+      <w:tblGrid>
+        <w:gridCol w:w="3041"/>
+        <w:gridCol w:w="2941"/>
+        <w:gridCol w:w="2941"/>
+      </w:tblGrid>
+      <w:tr>
+        <w:trPr>
+          <w:trHeight w:val="359"/>
+        </w:trPr>
+        <w:tc>
+          <w:tcPr>
+            <w:tcW w:w="3041" w:type="dxa"/>
+            <w:shd w:val="clear" w:color="auto" w:fill="C6D9F1" w:themeFill="text2" w:themeFillTint="33"/>
+          </w:tcPr>
+          <w:p>
+            <w:r>
+              <w:rPr>
+                <w:sz w:val="28"/>
+                <w:szCs w:val="28"/>
+              </w:rPr>
+              <w:t>Teszt adat:</w:t>
+            </w:r>
+          </w:p>
+        </w:tc>
+        <w:tc>
+          <w:tcPr>
+            <w:tcW w:w="2941" w:type="dxa"/>
+            <w:shd w:val="clear" w:color="auto" w:fill="C6D9F1" w:themeFill="text2" w:themeFillTint="33"/>
+          </w:tcPr>
+          <w:p>
+            <w:pPr>
+              <w:tabs>
+                <w:tab w:val="right" w:pos="1979"/>
+              </w:tabs>
+            </w:pPr>
+            <w:r>
+              <w:rPr>
+                <w:sz w:val="28"/>
+                <w:szCs w:val="28"/>
+              </w:rPr>
+              <w:t>Várt eredmény</w:t>
+            </w:r>
+          </w:p>
+        </w:tc>
+        <w:tc>
+          <w:tcPr>
+            <w:tcW w:w="2941" w:type="dxa"/>
+            <w:shd w:val="clear" w:color="auto" w:fill="C6D9F1" w:themeFill="text2" w:themeFillTint="33"/>
+          </w:tcPr>
+          <w:p>
+            <w:r>
+              <w:rPr>
+                <w:sz w:val="28"/>
+                <w:szCs w:val="28"/>
+              </w:rPr>
+              <w:t>Kapott eredmény</w:t>
+            </w:r>
+          </w:p>
+        </w:tc>
+      </w:tr>
+      <w:tr>
+        <w:trPr>
+          <w:trHeight w:val="359"/>
+        </w:trPr>
+        <w:tc>
+          <w:tcPr>
+            <w:tcW w:w="3041" w:type="dxa"/>
+          </w:tcPr>
+          <w:p>
+            <w:r>
+              <w:t>Név: Teszt Elek</w:t>
+            </w:r>
+          </w:p>
+        </w:tc>
+        <w:tc>
+          <w:tcPr>
+            <w:tcW w:w="2941" w:type="dxa"/>
+          </w:tcPr>
+          <w:p>
+            <w:r>
+              <w:t>Név elfogadva</w:t>
+            </w:r>
+          </w:p>
+        </w:tc>
+        <w:tc>
+          <w:tcPr>
+            <w:tcW w:w="2941" w:type="dxa"/>
+          </w:tcPr>
+          <w:p>
+            <w:r>
+              <w:t>Név elfogadva</w:t>
+            </w:r>
+          </w:p>
+        </w:tc>
+      </w:tr>
+      <w:tr>
+        <w:trPr>
+          <w:trHeight w:val="359"/>
+        </w:trPr>
+        <w:tc>
+          <w:tcPr>
+            <w:tcW w:w="3041" w:type="dxa"/>
+          </w:tcPr>
+          <w:p>
+            <w:r>
+              <w:t xml:space="preserve">Email: </w:t>
+            </w:r>
+            <w:hyperlink r:id="rId7" w:history="1">
+              <w:r>
+                <w:rPr>
+                  <w:rStyle w:val="Hiperhivatkozs"/>
+                </w:rPr>
+                <w:t>Tesztelek@gmail.com</w:t>
+              </w:r>
+            </w:hyperlink>
+          </w:p>
+        </w:tc>
+        <w:tc>
+          <w:tcPr>
+            <w:tcW w:w="2941" w:type="dxa"/>
+          </w:tcPr>
+          <w:p>
+            <w:r>
+              <w:t xml:space="preserve">Email </w:t>
+            </w:r>
+            <w:r>
+              <w:t>nem elfogadva</w:t>
+            </w:r>
+          </w:p>
+        </w:tc>
+        <w:tc>
+          <w:tcPr>
+            <w:tcW w:w="2941" w:type="dxa"/>
+          </w:tcPr>
+          <w:p>
+            <w:r>
+              <w:t>Email</w:t>
+            </w:r>
+            <w:r>
+              <w:t xml:space="preserve"> nem</w:t>
+            </w:r>
+            <w:r>
+              <w:t xml:space="preserve"> elfogadva</w:t>
+            </w:r>
+          </w:p>
+        </w:tc>
+      </w:tr>
+      <w:tr>
+        <w:trPr>
+          <w:trHeight w:val="359"/>
+        </w:trPr>
+        <w:tc>
+          <w:tcPr>
+            <w:tcW w:w="3041" w:type="dxa"/>
+          </w:tcPr>
+          <w:p>
+            <w:r>
+              <w:t>Jelszó:12345678</w:t>
+            </w:r>
+          </w:p>
+        </w:tc>
+        <w:tc>
+          <w:tcPr>
+            <w:tcW w:w="2941" w:type="dxa"/>
+          </w:tcPr>
+          <w:p>
+            <w:r>
+              <w:t>Jelszó elfogadva</w:t>
+            </w:r>
+          </w:p>
+        </w:tc>
+        <w:tc>
+          <w:tcPr>
+            <w:tcW w:w="2941" w:type="dxa"/>
+          </w:tcPr>
+          <w:p>
+            <w:r>
+              <w:t>Jelszó elfogadva</w:t>
+            </w:r>
+          </w:p>
+        </w:tc>
+      </w:tr>
+      <w:tr>
+        <w:trPr>
+          <w:trHeight w:val="359"/>
+        </w:trPr>
+        <w:tc>
+          <w:tcPr>
+            <w:tcW w:w="3041" w:type="dxa"/>
+          </w:tcPr>
+          <w:p>
+            <w:r>
+              <w:t>Jelszó meg:12345678</w:t>
+            </w:r>
+          </w:p>
+        </w:tc>
+        <w:tc>
+          <w:tcPr>
+            <w:tcW w:w="2941" w:type="dxa"/>
+          </w:tcPr>
+          <w:p>
+            <w:r>
+              <w:t xml:space="preserve">A felhasználó </w:t>
+            </w:r>
+            <w:r>
+              <w:t>nem tud regisztrálni.</w:t>
+            </w:r>
+          </w:p>
+        </w:tc>
+        <w:tc>
+          <w:tcPr>
+            <w:tcW w:w="2941" w:type="dxa"/>
+          </w:tcPr>
+          <w:p>
+            <w:r>
+              <w:t xml:space="preserve">A felhasználó </w:t>
+            </w:r>
+            <w:r>
+              <w:t xml:space="preserve">nem tud </w:t>
+            </w:r>
+            <w:r>
+              <w:t>regisztrál</w:t>
+            </w:r>
+            <w:r>
+              <w:t>ni.</w:t>
+            </w:r>
+          </w:p>
+        </w:tc>
+      </w:tr>
+    </w:tbl>
+    <w:p/>
     <w:p>
       <w:pPr>
         <w:pStyle w:val="Cmsor2"/>
@@ -172,9 +653,6 @@
       </w:r>
       <w:r>
         <w:br/>
-      </w:r>
-      <w:r>
-        <w:lastRenderedPageBreak/>
         <w:t>Lépések:</w:t>
       </w:r>
       <w:r>
@@ -187,10 +665,7 @@
       </w:r>
       <w:r>
         <w:br/>
-        <w:t>- Megadja az email címet é</w:t>
-      </w:r>
-      <w:r>
-        <w:t>s jelszót.</w:t>
+        <w:t>- Megadja az email címet és jelszót.</w:t>
       </w:r>
       <w:r>
         <w:br/>
@@ -220,15 +695,200 @@
       </w:r>
       <w:r>
         <w:br/>
-        <w:t>Annak validálása, hogy a felhasználó sikeresen be</w:t>
+        <w:t xml:space="preserve">Annak </w:t>
       </w:r>
+      <w:proofErr w:type="spellStart"/>
       <w:r>
-        <w:t xml:space="preserve"> tud jelentkezni.</w:t>
+        <w:t>validálása</w:t>
       </w:r>
+      <w:proofErr w:type="spellEnd"/>
       <w:r>
-        <w:br/>
+        <w:t>, hogy a felhasználó sikeresen be tud jelentkezni.</w:t>
       </w:r>
     </w:p>
+    <w:tbl>
+      <w:tblPr>
+        <w:tblStyle w:val="Rcsostblzat"/>
+        <w:tblW w:w="8923" w:type="dxa"/>
+        <w:tblLook w:val="04A0" w:firstRow="1" w:lastRow="0" w:firstColumn="1" w:lastColumn="0" w:noHBand="0" w:noVBand="1"/>
+      </w:tblPr>
+      <w:tblGrid>
+        <w:gridCol w:w="3041"/>
+        <w:gridCol w:w="2941"/>
+        <w:gridCol w:w="2941"/>
+      </w:tblGrid>
+      <w:tr>
+        <w:trPr>
+          <w:trHeight w:val="359"/>
+        </w:trPr>
+        <w:tc>
+          <w:tcPr>
+            <w:tcW w:w="3041" w:type="dxa"/>
+            <w:shd w:val="clear" w:color="auto" w:fill="C6D9F1" w:themeFill="text2" w:themeFillTint="33"/>
+          </w:tcPr>
+          <w:p>
+            <w:r>
+              <w:rPr>
+                <w:sz w:val="28"/>
+                <w:szCs w:val="28"/>
+              </w:rPr>
+              <w:t>Teszt adat:</w:t>
+            </w:r>
+          </w:p>
+        </w:tc>
+        <w:tc>
+          <w:tcPr>
+            <w:tcW w:w="2941" w:type="dxa"/>
+            <w:shd w:val="clear" w:color="auto" w:fill="C6D9F1" w:themeFill="text2" w:themeFillTint="33"/>
+          </w:tcPr>
+          <w:p>
+            <w:pPr>
+              <w:tabs>
+                <w:tab w:val="right" w:pos="1979"/>
+              </w:tabs>
+            </w:pPr>
+            <w:r>
+              <w:rPr>
+                <w:sz w:val="28"/>
+                <w:szCs w:val="28"/>
+              </w:rPr>
+              <w:t>Várt eredmény</w:t>
+            </w:r>
+          </w:p>
+        </w:tc>
+        <w:tc>
+          <w:tcPr>
+            <w:tcW w:w="2941" w:type="dxa"/>
+            <w:shd w:val="clear" w:color="auto" w:fill="C6D9F1" w:themeFill="text2" w:themeFillTint="33"/>
+          </w:tcPr>
+          <w:p>
+            <w:r>
+              <w:rPr>
+                <w:sz w:val="28"/>
+                <w:szCs w:val="28"/>
+              </w:rPr>
+              <w:t>Kapott eredmény</w:t>
+            </w:r>
+          </w:p>
+        </w:tc>
+      </w:tr>
+      <w:tr>
+        <w:trPr>
+          <w:trHeight w:val="359"/>
+        </w:trPr>
+        <w:tc>
+          <w:tcPr>
+            <w:tcW w:w="3041" w:type="dxa"/>
+          </w:tcPr>
+          <w:p>
+            <w:r>
+              <w:t xml:space="preserve">Email: </w:t>
+            </w:r>
+            <w:hyperlink r:id="rId8" w:history="1">
+              <w:r>
+                <w:rPr>
+                  <w:rStyle w:val="Hiperhivatkozs"/>
+                </w:rPr>
+                <w:t>Tesztelek@gmail.com</w:t>
+              </w:r>
+            </w:hyperlink>
+          </w:p>
+        </w:tc>
+        <w:tc>
+          <w:tcPr>
+            <w:tcW w:w="2941" w:type="dxa"/>
+          </w:tcPr>
+          <w:p>
+            <w:r>
+              <w:t>Email elfogadva</w:t>
+            </w:r>
+          </w:p>
+        </w:tc>
+        <w:tc>
+          <w:tcPr>
+            <w:tcW w:w="2941" w:type="dxa"/>
+          </w:tcPr>
+          <w:p>
+            <w:r>
+              <w:t>Email elfogadva</w:t>
+            </w:r>
+          </w:p>
+        </w:tc>
+      </w:tr>
+      <w:tr>
+        <w:trPr>
+          <w:trHeight w:val="359"/>
+        </w:trPr>
+        <w:tc>
+          <w:tcPr>
+            <w:tcW w:w="3041" w:type="dxa"/>
+          </w:tcPr>
+          <w:p>
+            <w:r>
+              <w:t>Jelszó:12345678</w:t>
+            </w:r>
+          </w:p>
+        </w:tc>
+        <w:tc>
+          <w:tcPr>
+            <w:tcW w:w="2941" w:type="dxa"/>
+          </w:tcPr>
+          <w:p>
+            <w:r>
+              <w:t>Jelszó elfogadva</w:t>
+            </w:r>
+          </w:p>
+        </w:tc>
+        <w:tc>
+          <w:tcPr>
+            <w:tcW w:w="2941" w:type="dxa"/>
+          </w:tcPr>
+          <w:p>
+            <w:r>
+              <w:t>Jelszó elfogadva</w:t>
+            </w:r>
+          </w:p>
+        </w:tc>
+      </w:tr>
+      <w:tr>
+        <w:trPr>
+          <w:trHeight w:val="359"/>
+        </w:trPr>
+        <w:tc>
+          <w:tcPr>
+            <w:tcW w:w="3041" w:type="dxa"/>
+          </w:tcPr>
+          <w:p/>
+        </w:tc>
+        <w:tc>
+          <w:tcPr>
+            <w:tcW w:w="2941" w:type="dxa"/>
+          </w:tcPr>
+          <w:p>
+            <w:r>
+              <w:t xml:space="preserve">A felhasználó </w:t>
+            </w:r>
+            <w:r>
+              <w:t>bejelentkezett.</w:t>
+            </w:r>
+          </w:p>
+        </w:tc>
+        <w:tc>
+          <w:tcPr>
+            <w:tcW w:w="2941" w:type="dxa"/>
+          </w:tcPr>
+          <w:p>
+            <w:r>
+              <w:t xml:space="preserve">A felhasználó </w:t>
+            </w:r>
+            <w:r>
+              <w:t>bejelentkezett.</w:t>
+            </w:r>
+          </w:p>
+        </w:tc>
+      </w:tr>
+    </w:tbl>
+    <w:p/>
     <w:p>
       <w:pPr>
         <w:pStyle w:val="Cmsor2"/>
@@ -259,10 +919,10 @@
       </w:r>
       <w:r>
         <w:br/>
-        <w:t>- Kiválasztja az aktivitási sz</w:t>
       </w:r>
       <w:r>
-        <w:t>intet és célt.</w:t>
+        <w:lastRenderedPageBreak/>
+        <w:t>- Kiválasztja az aktivitási szintet és célt.</w:t>
       </w:r>
       <w:r>
         <w:br/>
@@ -290,10 +950,340 @@
         <w:br/>
         <w:t>Annak ellenőrzése, hogy a profiladatok mentése megfelelően működik.</w:t>
       </w:r>
-      <w:r>
-        <w:br/>
-      </w:r>
     </w:p>
+    <w:tbl>
+      <w:tblPr>
+        <w:tblStyle w:val="Rcsostblzat"/>
+        <w:tblW w:w="8923" w:type="dxa"/>
+        <w:tblLook w:val="04A0" w:firstRow="1" w:lastRow="0" w:firstColumn="1" w:lastColumn="0" w:noHBand="0" w:noVBand="1"/>
+      </w:tblPr>
+      <w:tblGrid>
+        <w:gridCol w:w="3041"/>
+        <w:gridCol w:w="2941"/>
+        <w:gridCol w:w="2941"/>
+      </w:tblGrid>
+      <w:tr>
+        <w:trPr>
+          <w:trHeight w:val="359"/>
+        </w:trPr>
+        <w:tc>
+          <w:tcPr>
+            <w:tcW w:w="3041" w:type="dxa"/>
+            <w:shd w:val="clear" w:color="auto" w:fill="C6D9F1" w:themeFill="text2" w:themeFillTint="33"/>
+          </w:tcPr>
+          <w:p>
+            <w:r>
+              <w:rPr>
+                <w:sz w:val="28"/>
+                <w:szCs w:val="28"/>
+              </w:rPr>
+              <w:t>Teszt adat:</w:t>
+            </w:r>
+          </w:p>
+        </w:tc>
+        <w:tc>
+          <w:tcPr>
+            <w:tcW w:w="2941" w:type="dxa"/>
+            <w:shd w:val="clear" w:color="auto" w:fill="C6D9F1" w:themeFill="text2" w:themeFillTint="33"/>
+          </w:tcPr>
+          <w:p>
+            <w:pPr>
+              <w:tabs>
+                <w:tab w:val="right" w:pos="1979"/>
+              </w:tabs>
+            </w:pPr>
+            <w:r>
+              <w:rPr>
+                <w:sz w:val="28"/>
+                <w:szCs w:val="28"/>
+              </w:rPr>
+              <w:t>Várt eredmény</w:t>
+            </w:r>
+          </w:p>
+        </w:tc>
+        <w:tc>
+          <w:tcPr>
+            <w:tcW w:w="2941" w:type="dxa"/>
+            <w:shd w:val="clear" w:color="auto" w:fill="C6D9F1" w:themeFill="text2" w:themeFillTint="33"/>
+          </w:tcPr>
+          <w:p>
+            <w:r>
+              <w:rPr>
+                <w:sz w:val="28"/>
+                <w:szCs w:val="28"/>
+              </w:rPr>
+              <w:t>Kapott eredmény</w:t>
+            </w:r>
+          </w:p>
+        </w:tc>
+      </w:tr>
+      <w:tr>
+        <w:trPr>
+          <w:trHeight w:val="359"/>
+        </w:trPr>
+        <w:tc>
+          <w:tcPr>
+            <w:tcW w:w="3041" w:type="dxa"/>
+          </w:tcPr>
+          <w:p>
+            <w:r>
+              <w:t xml:space="preserve">Email: </w:t>
+            </w:r>
+            <w:hyperlink r:id="rId9" w:history="1">
+              <w:r>
+                <w:rPr>
+                  <w:rStyle w:val="Hiperhivatkozs"/>
+                </w:rPr>
+                <w:t>Tesztelek@gmail.com</w:t>
+              </w:r>
+            </w:hyperlink>
+          </w:p>
+        </w:tc>
+        <w:tc>
+          <w:tcPr>
+            <w:tcW w:w="2941" w:type="dxa"/>
+          </w:tcPr>
+          <w:p>
+            <w:r>
+              <w:t>Email elfogadva</w:t>
+            </w:r>
+          </w:p>
+        </w:tc>
+        <w:tc>
+          <w:tcPr>
+            <w:tcW w:w="2941" w:type="dxa"/>
+          </w:tcPr>
+          <w:p>
+            <w:r>
+              <w:t>Email elfogadva</w:t>
+            </w:r>
+          </w:p>
+        </w:tc>
+      </w:tr>
+      <w:tr>
+        <w:trPr>
+          <w:trHeight w:val="359"/>
+        </w:trPr>
+        <w:tc>
+          <w:tcPr>
+            <w:tcW w:w="3041" w:type="dxa"/>
+          </w:tcPr>
+          <w:p>
+            <w:r>
+              <w:t>Jelszó:12345678</w:t>
+            </w:r>
+          </w:p>
+        </w:tc>
+        <w:tc>
+          <w:tcPr>
+            <w:tcW w:w="2941" w:type="dxa"/>
+          </w:tcPr>
+          <w:p>
+            <w:r>
+              <w:t>Jelszó elfogadva</w:t>
+            </w:r>
+          </w:p>
+        </w:tc>
+        <w:tc>
+          <w:tcPr>
+            <w:tcW w:w="2941" w:type="dxa"/>
+          </w:tcPr>
+          <w:p>
+            <w:r>
+              <w:t>Jelszó elfogadva</w:t>
+            </w:r>
+          </w:p>
+        </w:tc>
+      </w:tr>
+      <w:tr>
+        <w:trPr>
+          <w:trHeight w:val="359"/>
+        </w:trPr>
+        <w:tc>
+          <w:tcPr>
+            <w:tcW w:w="3041" w:type="dxa"/>
+          </w:tcPr>
+          <w:p>
+            <w:r>
+              <w:t>Szül dátum: 2007-01-10</w:t>
+            </w:r>
+          </w:p>
+        </w:tc>
+        <w:tc>
+          <w:tcPr>
+            <w:tcW w:w="2941" w:type="dxa"/>
+          </w:tcPr>
+          <w:p>
+            <w:r>
+              <w:t>Dátum elfogadva</w:t>
+            </w:r>
+          </w:p>
+        </w:tc>
+        <w:tc>
+          <w:tcPr>
+            <w:tcW w:w="2941" w:type="dxa"/>
+          </w:tcPr>
+          <w:p>
+            <w:r>
+              <w:t>Dátum elfogadva</w:t>
+            </w:r>
+          </w:p>
+        </w:tc>
+      </w:tr>
+      <w:tr>
+        <w:trPr>
+          <w:trHeight w:val="359"/>
+        </w:trPr>
+        <w:tc>
+          <w:tcPr>
+            <w:tcW w:w="3041" w:type="dxa"/>
+          </w:tcPr>
+          <w:p>
+            <w:r>
+              <w:t>Nem: férfi</w:t>
+            </w:r>
+          </w:p>
+        </w:tc>
+        <w:tc>
+          <w:tcPr>
+            <w:tcW w:w="2941" w:type="dxa"/>
+          </w:tcPr>
+          <w:p>
+            <w:r>
+              <w:t>Nem elfogadva</w:t>
+            </w:r>
+          </w:p>
+        </w:tc>
+        <w:tc>
+          <w:tcPr>
+            <w:tcW w:w="2941" w:type="dxa"/>
+          </w:tcPr>
+          <w:p>
+            <w:r>
+              <w:t>Nem elfogadva</w:t>
+            </w:r>
+          </w:p>
+        </w:tc>
+      </w:tr>
+      <w:tr>
+        <w:trPr>
+          <w:trHeight w:val="359"/>
+        </w:trPr>
+        <w:tc>
+          <w:tcPr>
+            <w:tcW w:w="3041" w:type="dxa"/>
+          </w:tcPr>
+          <w:p>
+            <w:r>
+              <w:t>Magasság: 170</w:t>
+            </w:r>
+          </w:p>
+        </w:tc>
+        <w:tc>
+          <w:tcPr>
+            <w:tcW w:w="2941" w:type="dxa"/>
+          </w:tcPr>
+          <w:p>
+            <w:r>
+              <w:t>Magasság elfogadva</w:t>
+            </w:r>
+          </w:p>
+        </w:tc>
+        <w:tc>
+          <w:tcPr>
+            <w:tcW w:w="2941" w:type="dxa"/>
+          </w:tcPr>
+          <w:p>
+            <w:r>
+              <w:t>Magasság elfogadva</w:t>
+            </w:r>
+          </w:p>
+        </w:tc>
+      </w:tr>
+      <w:tr>
+        <w:trPr>
+          <w:trHeight w:val="359"/>
+        </w:trPr>
+        <w:tc>
+          <w:tcPr>
+            <w:tcW w:w="3041" w:type="dxa"/>
+          </w:tcPr>
+          <w:p>
+            <w:r>
+              <w:t>Testsúly: 70</w:t>
+            </w:r>
+          </w:p>
+        </w:tc>
+        <w:tc>
+          <w:tcPr>
+            <w:tcW w:w="2941" w:type="dxa"/>
+          </w:tcPr>
+          <w:p>
+            <w:r>
+              <w:t>Testsúly elfogadva</w:t>
+            </w:r>
+          </w:p>
+        </w:tc>
+        <w:tc>
+          <w:tcPr>
+            <w:tcW w:w="2941" w:type="dxa"/>
+          </w:tcPr>
+          <w:p>
+            <w:r>
+              <w:t>Testsúly elfogadva</w:t>
+            </w:r>
+          </w:p>
+        </w:tc>
+      </w:tr>
+      <w:tr>
+        <w:trPr>
+          <w:trHeight w:val="359"/>
+        </w:trPr>
+        <w:tc>
+          <w:tcPr>
+            <w:tcW w:w="3041" w:type="dxa"/>
+          </w:tcPr>
+          <w:p/>
+        </w:tc>
+        <w:tc>
+          <w:tcPr>
+            <w:tcW w:w="2941" w:type="dxa"/>
+          </w:tcPr>
+          <w:p>
+            <w:r>
+              <w:t xml:space="preserve">A profil </w:t>
+            </w:r>
+            <w:proofErr w:type="spellStart"/>
+            <w:r>
+              <w:t>kieg</w:t>
+            </w:r>
+            <w:proofErr w:type="spellEnd"/>
+            <w:r>
+              <w:t>. sikeres</w:t>
+            </w:r>
+          </w:p>
+        </w:tc>
+        <w:tc>
+          <w:tcPr>
+            <w:tcW w:w="2941" w:type="dxa"/>
+          </w:tcPr>
+          <w:p>
+            <w:r>
+              <w:t xml:space="preserve">A profil </w:t>
+            </w:r>
+            <w:proofErr w:type="spellStart"/>
+            <w:r>
+              <w:t>kieg</w:t>
+            </w:r>
+            <w:proofErr w:type="spellEnd"/>
+            <w:r>
+              <w:t>. sikeres.</w:t>
+            </w:r>
+          </w:p>
+        </w:tc>
+      </w:tr>
+    </w:tbl>
+    <w:p/>
     <w:p>
       <w:pPr>
         <w:pStyle w:val="Cmsor2"/>
@@ -305,24 +1295,17 @@
     <w:p>
       <w:r>
         <w:br/>
-        <w:t>Ez a teszt az étel naplózás funkció mű</w:t>
-      </w:r>
-      <w:r>
-        <w:t>ködését vizsgálja.</w:t>
+        <w:t>Ez a teszt az étel naplózás funkció működését vizsgálja.</w:t>
       </w:r>
       <w:r>
         <w:br/>
       </w:r>
       <w:r>
         <w:br/>
-      </w:r>
-      <w:r>
         <w:t>Lépések:</w:t>
       </w:r>
       <w:r>
         <w:br/>
-      </w:r>
-      <w:r>
         <w:t>- Bejelentkezik a rendszerbe.</w:t>
       </w:r>
       <w:r>
@@ -350,27 +1333,275 @@
       </w:r>
       <w:r>
         <w:br/>
-        <w:t>- A teszt ellenőrzi, hogy a „Baná</w:t>
-      </w:r>
-      <w:r>
-        <w:t>n” szöveg megjelenik-e a napi étellistában.</w:t>
+        <w:t>- A teszt ellenőrzi, hogy a „Banán” szöveg megjelenik-e a napi étellistában.</w:t>
       </w:r>
       <w:r>
         <w:br/>
       </w:r>
       <w:r>
-        <w:lastRenderedPageBreak/>
         <w:br/>
         <w:t>Cél:</w:t>
       </w:r>
       <w:r>
         <w:br/>
-        <w:t>Annak validálása, hogy az étel sikeresen hozzáadható a napi naplóhoz.</w:t>
+        <w:t xml:space="preserve">Annak </w:t>
       </w:r>
+      <w:proofErr w:type="spellStart"/>
       <w:r>
-        <w:br/>
+        <w:t>validálása</w:t>
+      </w:r>
+      <w:proofErr w:type="spellEnd"/>
+      <w:r>
+        <w:t>, hogy az étel sikeresen hozzáadható a napi naplóhoz.</w:t>
       </w:r>
     </w:p>
+    <w:tbl>
+      <w:tblPr>
+        <w:tblStyle w:val="Rcsostblzat"/>
+        <w:tblW w:w="8923" w:type="dxa"/>
+        <w:tblLook w:val="04A0" w:firstRow="1" w:lastRow="0" w:firstColumn="1" w:lastColumn="0" w:noHBand="0" w:noVBand="1"/>
+      </w:tblPr>
+      <w:tblGrid>
+        <w:gridCol w:w="3041"/>
+        <w:gridCol w:w="2941"/>
+        <w:gridCol w:w="2941"/>
+      </w:tblGrid>
+      <w:tr>
+        <w:trPr>
+          <w:trHeight w:val="359"/>
+        </w:trPr>
+        <w:tc>
+          <w:tcPr>
+            <w:tcW w:w="3041" w:type="dxa"/>
+            <w:shd w:val="clear" w:color="auto" w:fill="C6D9F1" w:themeFill="text2" w:themeFillTint="33"/>
+          </w:tcPr>
+          <w:p>
+            <w:r>
+              <w:rPr>
+                <w:sz w:val="28"/>
+                <w:szCs w:val="28"/>
+              </w:rPr>
+              <w:t>Teszt adat:</w:t>
+            </w:r>
+          </w:p>
+        </w:tc>
+        <w:tc>
+          <w:tcPr>
+            <w:tcW w:w="2941" w:type="dxa"/>
+            <w:shd w:val="clear" w:color="auto" w:fill="C6D9F1" w:themeFill="text2" w:themeFillTint="33"/>
+          </w:tcPr>
+          <w:p>
+            <w:pPr>
+              <w:tabs>
+                <w:tab w:val="right" w:pos="1979"/>
+              </w:tabs>
+            </w:pPr>
+            <w:r>
+              <w:rPr>
+                <w:sz w:val="28"/>
+                <w:szCs w:val="28"/>
+              </w:rPr>
+              <w:t>Várt eredmény</w:t>
+            </w:r>
+          </w:p>
+        </w:tc>
+        <w:tc>
+          <w:tcPr>
+            <w:tcW w:w="2941" w:type="dxa"/>
+            <w:shd w:val="clear" w:color="auto" w:fill="C6D9F1" w:themeFill="text2" w:themeFillTint="33"/>
+          </w:tcPr>
+          <w:p>
+            <w:r>
+              <w:rPr>
+                <w:sz w:val="28"/>
+                <w:szCs w:val="28"/>
+              </w:rPr>
+              <w:t>Kapott eredmény</w:t>
+            </w:r>
+          </w:p>
+        </w:tc>
+      </w:tr>
+      <w:tr>
+        <w:trPr>
+          <w:trHeight w:val="359"/>
+        </w:trPr>
+        <w:tc>
+          <w:tcPr>
+            <w:tcW w:w="3041" w:type="dxa"/>
+          </w:tcPr>
+          <w:p>
+            <w:r>
+              <w:t xml:space="preserve">Email: </w:t>
+            </w:r>
+            <w:hyperlink r:id="rId10" w:history="1">
+              <w:r>
+                <w:rPr>
+                  <w:rStyle w:val="Hiperhivatkozs"/>
+                </w:rPr>
+                <w:t>Tesztelek@gmail.com</w:t>
+              </w:r>
+            </w:hyperlink>
+          </w:p>
+        </w:tc>
+        <w:tc>
+          <w:tcPr>
+            <w:tcW w:w="2941" w:type="dxa"/>
+          </w:tcPr>
+          <w:p>
+            <w:r>
+              <w:t>Email elfogadva</w:t>
+            </w:r>
+          </w:p>
+        </w:tc>
+        <w:tc>
+          <w:tcPr>
+            <w:tcW w:w="2941" w:type="dxa"/>
+          </w:tcPr>
+          <w:p>
+            <w:r>
+              <w:t>Email elfogadva</w:t>
+            </w:r>
+          </w:p>
+        </w:tc>
+      </w:tr>
+      <w:tr>
+        <w:trPr>
+          <w:trHeight w:val="359"/>
+        </w:trPr>
+        <w:tc>
+          <w:tcPr>
+            <w:tcW w:w="3041" w:type="dxa"/>
+          </w:tcPr>
+          <w:p>
+            <w:r>
+              <w:t>Jelszó:12345678</w:t>
+            </w:r>
+          </w:p>
+        </w:tc>
+        <w:tc>
+          <w:tcPr>
+            <w:tcW w:w="2941" w:type="dxa"/>
+          </w:tcPr>
+          <w:p>
+            <w:r>
+              <w:t>Jelszó elfogadva</w:t>
+            </w:r>
+          </w:p>
+        </w:tc>
+        <w:tc>
+          <w:tcPr>
+            <w:tcW w:w="2941" w:type="dxa"/>
+          </w:tcPr>
+          <w:p>
+            <w:r>
+              <w:t>Jelszó elfogadva</w:t>
+            </w:r>
+          </w:p>
+        </w:tc>
+      </w:tr>
+      <w:tr>
+        <w:trPr>
+          <w:trHeight w:val="359"/>
+        </w:trPr>
+        <w:tc>
+          <w:tcPr>
+            <w:tcW w:w="3041" w:type="dxa"/>
+          </w:tcPr>
+          <w:p>
+            <w:r>
+              <w:t>Étel: Banán</w:t>
+            </w:r>
+          </w:p>
+        </w:tc>
+        <w:tc>
+          <w:tcPr>
+            <w:tcW w:w="2941" w:type="dxa"/>
+          </w:tcPr>
+          <w:p>
+            <w:r>
+              <w:t>Étel létezik, elfogadva</w:t>
+            </w:r>
+          </w:p>
+        </w:tc>
+        <w:tc>
+          <w:tcPr>
+            <w:tcW w:w="2941" w:type="dxa"/>
+          </w:tcPr>
+          <w:p>
+            <w:r>
+              <w:t>Étel létezik, elfogadva</w:t>
+            </w:r>
+          </w:p>
+        </w:tc>
+      </w:tr>
+      <w:tr>
+        <w:trPr>
+          <w:trHeight w:val="359"/>
+        </w:trPr>
+        <w:tc>
+          <w:tcPr>
+            <w:tcW w:w="3041" w:type="dxa"/>
+          </w:tcPr>
+          <w:p>
+            <w:r>
+              <w:t>Adag: 2</w:t>
+            </w:r>
+          </w:p>
+        </w:tc>
+        <w:tc>
+          <w:tcPr>
+            <w:tcW w:w="2941" w:type="dxa"/>
+          </w:tcPr>
+          <w:p>
+            <w:r>
+              <w:t>Reális adag, elfogadva</w:t>
+            </w:r>
+          </w:p>
+        </w:tc>
+        <w:tc>
+          <w:tcPr>
+            <w:tcW w:w="2941" w:type="dxa"/>
+          </w:tcPr>
+          <w:p>
+            <w:r>
+              <w:t>Reális adag, elfogadva</w:t>
+            </w:r>
+          </w:p>
+        </w:tc>
+      </w:tr>
+      <w:tr>
+        <w:trPr>
+          <w:trHeight w:val="359"/>
+        </w:trPr>
+        <w:tc>
+          <w:tcPr>
+            <w:tcW w:w="3041" w:type="dxa"/>
+          </w:tcPr>
+          <w:p/>
+        </w:tc>
+        <w:tc>
+          <w:tcPr>
+            <w:tcW w:w="2941" w:type="dxa"/>
+          </w:tcPr>
+          <w:p>
+            <w:r>
+              <w:t>Ételt sikeresen naplóztuk</w:t>
+            </w:r>
+          </w:p>
+        </w:tc>
+        <w:tc>
+          <w:tcPr>
+            <w:tcW w:w="2941" w:type="dxa"/>
+          </w:tcPr>
+          <w:p>
+            <w:r>
+              <w:t>Ételt sikeresen naplóztuk</w:t>
+            </w:r>
+          </w:p>
+        </w:tc>
+      </w:tr>
+    </w:tbl>
+    <w:p/>
     <w:p>
       <w:pPr>
         <w:pStyle w:val="Cmsor2"/>
@@ -381,15 +1612,7 @@
     </w:p>
     <w:p>
       <w:r>
-        <w:rPr>
-          <w:lang w:val="en-US"/>
-        </w:rPr>
         <w:br/>
-      </w:r>
-      <w:r>
-        <w:rPr>
-          <w:lang w:val="en-US"/>
-        </w:rPr>
         <w:t>Ez a teszt a felhasználó törlés</w:t>
       </w:r>
       <w:r>
@@ -400,8 +1623,6 @@
       </w:r>
       <w:r>
         <w:br/>
-      </w:r>
-      <w:r>
         <w:t>Lépések:</w:t>
       </w:r>
       <w:r>
@@ -409,8 +1630,6 @@
       </w:r>
       <w:r>
         <w:br/>
-      </w:r>
-      <w:r>
         <w:t>- Bejelentkezik a rendszerbe.</w:t>
       </w:r>
       <w:r>
@@ -418,20 +1637,14 @@
       </w:r>
       <w:r>
         <w:br/>
-      </w:r>
-      <w:r>
         <w:t>- Navigál a profil beállításokba</w:t>
       </w:r>
       <w:r>
         <w:br/>
-      </w:r>
-      <w:r>
         <w:t>- Az oldal aljára teker</w:t>
       </w:r>
       <w:r>
         <w:br/>
-      </w:r>
-      <w:r>
         <w:t>- Rákattint a profil törlése gombra és konfirmáció gombra</w:t>
       </w:r>
       <w:r>
@@ -439,8 +1652,6 @@
       </w:r>
       <w:r>
         <w:br/>
-      </w:r>
-      <w:r>
         <w:t>Ellenőrzés:</w:t>
       </w:r>
       <w:r>
@@ -448,8 +1659,6 @@
       </w:r>
       <w:r>
         <w:br/>
-      </w:r>
-      <w:r>
         <w:t>- A teszt ellenőrzi, hogy a felhasználó képes-e kitörölni a saját felhasználóját</w:t>
       </w:r>
       <w:r>
@@ -457,8 +1666,6 @@
       </w:r>
       <w:r>
         <w:br/>
-      </w:r>
-      <w:r>
         <w:t>Cél:</w:t>
       </w:r>
       <w:r>
@@ -466,11 +1673,200 @@
       </w:r>
       <w:r>
         <w:br/>
+        <w:t xml:space="preserve">Annak </w:t>
       </w:r>
+      <w:proofErr w:type="spellStart"/>
       <w:r>
-        <w:t>Annak validálása, hogy a felhasználó törlés funkció működőképes-e.</w:t>
+        <w:t>validálása</w:t>
+      </w:r>
+      <w:proofErr w:type="spellEnd"/>
+      <w:r>
+        <w:t>, hogy a felhasználó törlés funkció működőképes-e.</w:t>
       </w:r>
     </w:p>
+    <w:tbl>
+      <w:tblPr>
+        <w:tblStyle w:val="Rcsostblzat"/>
+        <w:tblW w:w="8923" w:type="dxa"/>
+        <w:tblLook w:val="04A0" w:firstRow="1" w:lastRow="0" w:firstColumn="1" w:lastColumn="0" w:noHBand="0" w:noVBand="1"/>
+      </w:tblPr>
+      <w:tblGrid>
+        <w:gridCol w:w="3041"/>
+        <w:gridCol w:w="2941"/>
+        <w:gridCol w:w="2941"/>
+      </w:tblGrid>
+      <w:tr>
+        <w:trPr>
+          <w:trHeight w:val="359"/>
+        </w:trPr>
+        <w:tc>
+          <w:tcPr>
+            <w:tcW w:w="3041" w:type="dxa"/>
+            <w:shd w:val="clear" w:color="auto" w:fill="C6D9F1" w:themeFill="text2" w:themeFillTint="33"/>
+          </w:tcPr>
+          <w:p>
+            <w:r>
+              <w:rPr>
+                <w:sz w:val="28"/>
+                <w:szCs w:val="28"/>
+              </w:rPr>
+              <w:t>Teszt adat:</w:t>
+            </w:r>
+          </w:p>
+        </w:tc>
+        <w:tc>
+          <w:tcPr>
+            <w:tcW w:w="2941" w:type="dxa"/>
+            <w:shd w:val="clear" w:color="auto" w:fill="C6D9F1" w:themeFill="text2" w:themeFillTint="33"/>
+          </w:tcPr>
+          <w:p>
+            <w:pPr>
+              <w:tabs>
+                <w:tab w:val="right" w:pos="1979"/>
+              </w:tabs>
+            </w:pPr>
+            <w:r>
+              <w:rPr>
+                <w:sz w:val="28"/>
+                <w:szCs w:val="28"/>
+              </w:rPr>
+              <w:t>Várt eredmény</w:t>
+            </w:r>
+          </w:p>
+        </w:tc>
+        <w:tc>
+          <w:tcPr>
+            <w:tcW w:w="2941" w:type="dxa"/>
+            <w:shd w:val="clear" w:color="auto" w:fill="C6D9F1" w:themeFill="text2" w:themeFillTint="33"/>
+          </w:tcPr>
+          <w:p>
+            <w:r>
+              <w:rPr>
+                <w:sz w:val="28"/>
+                <w:szCs w:val="28"/>
+              </w:rPr>
+              <w:t>Kapott eredmény</w:t>
+            </w:r>
+          </w:p>
+        </w:tc>
+      </w:tr>
+      <w:tr>
+        <w:trPr>
+          <w:trHeight w:val="359"/>
+        </w:trPr>
+        <w:tc>
+          <w:tcPr>
+            <w:tcW w:w="3041" w:type="dxa"/>
+          </w:tcPr>
+          <w:p>
+            <w:r>
+              <w:t xml:space="preserve">Email: </w:t>
+            </w:r>
+            <w:hyperlink r:id="rId11" w:history="1">
+              <w:r>
+                <w:rPr>
+                  <w:rStyle w:val="Hiperhivatkozs"/>
+                </w:rPr>
+                <w:t>Tesztelek@gmail.com</w:t>
+              </w:r>
+            </w:hyperlink>
+          </w:p>
+        </w:tc>
+        <w:tc>
+          <w:tcPr>
+            <w:tcW w:w="2941" w:type="dxa"/>
+          </w:tcPr>
+          <w:p>
+            <w:r>
+              <w:t>Email elfogadva</w:t>
+            </w:r>
+          </w:p>
+        </w:tc>
+        <w:tc>
+          <w:tcPr>
+            <w:tcW w:w="2941" w:type="dxa"/>
+          </w:tcPr>
+          <w:p>
+            <w:r>
+              <w:t>Email elfogadva</w:t>
+            </w:r>
+          </w:p>
+        </w:tc>
+      </w:tr>
+      <w:tr>
+        <w:trPr>
+          <w:trHeight w:val="359"/>
+        </w:trPr>
+        <w:tc>
+          <w:tcPr>
+            <w:tcW w:w="3041" w:type="dxa"/>
+          </w:tcPr>
+          <w:p>
+            <w:r>
+              <w:t>Jelszó:12345678</w:t>
+            </w:r>
+          </w:p>
+        </w:tc>
+        <w:tc>
+          <w:tcPr>
+            <w:tcW w:w="2941" w:type="dxa"/>
+          </w:tcPr>
+          <w:p>
+            <w:r>
+              <w:t>Jelszó elfogadva</w:t>
+            </w:r>
+          </w:p>
+        </w:tc>
+        <w:tc>
+          <w:tcPr>
+            <w:tcW w:w="2941" w:type="dxa"/>
+          </w:tcPr>
+          <w:p>
+            <w:r>
+              <w:t>Jelszó elfogadva</w:t>
+            </w:r>
+          </w:p>
+        </w:tc>
+      </w:tr>
+      <w:tr>
+        <w:trPr>
+          <w:trHeight w:val="359"/>
+        </w:trPr>
+        <w:tc>
+          <w:tcPr>
+            <w:tcW w:w="3041" w:type="dxa"/>
+          </w:tcPr>
+          <w:p/>
+        </w:tc>
+        <w:tc>
+          <w:tcPr>
+            <w:tcW w:w="2941" w:type="dxa"/>
+          </w:tcPr>
+          <w:p>
+            <w:r>
+              <w:t xml:space="preserve">A felhasználó </w:t>
+            </w:r>
+            <w:r>
+              <w:t>sikeresen törölve</w:t>
+            </w:r>
+          </w:p>
+        </w:tc>
+        <w:tc>
+          <w:tcPr>
+            <w:tcW w:w="2941" w:type="dxa"/>
+          </w:tcPr>
+          <w:p>
+            <w:r>
+              <w:t xml:space="preserve">A felhasználó </w:t>
+            </w:r>
+            <w:r>
+              <w:t>sikeresen törölve.</w:t>
+            </w:r>
+          </w:p>
+        </w:tc>
+      </w:tr>
+    </w:tbl>
+    <w:p/>
     <w:sectPr>
       <w:pgSz w:w="12240" w:h="15840"/>
       <w:pgMar w:top="1440" w:right="1800" w:bottom="1440" w:left="1800" w:header="720" w:footer="720" w:gutter="0"/>
@@ -969,11 +2365,6 @@
     <w:lsdException w:name="Book Title" w:uiPriority="33" w:qFormat="1"/>
     <w:lsdException w:name="Bibliography" w:semiHidden="1" w:uiPriority="37" w:unhideWhenUsed="1"/>
     <w:lsdException w:name="TOC Heading" w:semiHidden="1" w:uiPriority="39" w:unhideWhenUsed="1" w:qFormat="1"/>
-    <w:lsdException w:name="Plain Table 5" w:semiHidden="1" w:unhideWhenUsed="1"/>
-    <w:lsdException w:name="Grid Table Light" w:semiHidden="1" w:unhideWhenUsed="1"/>
-    <w:lsdException w:name="Grid Table 1 Light" w:semiHidden="1" w:unhideWhenUsed="1"/>
-    <w:lsdException w:name="Grid Table 2" w:semiHidden="1" w:unhideWhenUsed="1"/>
-    <w:lsdException w:name="Grid Table 3" w:semiHidden="1" w:unhideWhenUsed="1"/>
     <w:lsdException w:name="Grid Table 4" w:uiPriority="49"/>
     <w:lsdException w:name="Grid Table 5 Dark" w:uiPriority="50"/>
     <w:lsdException w:name="Grid Table 6 Colorful" w:uiPriority="51"/>
@@ -1078,7 +2469,7 @@
   <w:style w:type="paragraph" w:default="1" w:styleId="Norml">
     <w:name w:val="Normal"/>
     <w:qFormat/>
-    <w:rsid w:val="00FC693F"/>
+    <w:rsid w:val="00F53185"/>
     <w:rPr>
       <w:lang w:val="hu-HU"/>
     </w:rPr>
@@ -12071,6 +13462,29 @@
         <w:shd w:val="clear" w:color="auto" w:fill="FBCAA2" w:themeFill="accent6" w:themeFillTint="7F"/>
       </w:tcPr>
     </w:tblStylePr>
+  </w:style>
+  <w:style w:type="character" w:styleId="Hiperhivatkozs">
+    <w:name w:val="Hyperlink"/>
+    <w:basedOn w:val="Bekezdsalapbettpusa"/>
+    <w:uiPriority w:val="99"/>
+    <w:unhideWhenUsed/>
+    <w:rsid w:val="0092349B"/>
+    <w:rPr>
+      <w:color w:val="0000FF" w:themeColor="hyperlink"/>
+      <w:u w:val="single"/>
+    </w:rPr>
+  </w:style>
+  <w:style w:type="character" w:styleId="Feloldatlanmegemlts">
+    <w:name w:val="Unresolved Mention"/>
+    <w:basedOn w:val="Bekezdsalapbettpusa"/>
+    <w:uiPriority w:val="99"/>
+    <w:semiHidden/>
+    <w:unhideWhenUsed/>
+    <w:rsid w:val="0092349B"/>
+    <w:rPr>
+      <w:color w:val="605E5C"/>
+      <w:shd w:val="clear" w:color="auto" w:fill="E1DFDD"/>
+    </w:rPr>
   </w:style>
 </w:styles>
 </file>

</xml_diff>